<commit_message>
Let the survey builder negate ordering comparisons, and write QRE_1's age rule as two rules
A terminate rule such as "S1 < 18" raised "cannot invert", because only ==
and != could be negated. A parenthesised comparison is now negated as a whole,
the way a compound expression already was.

QRE_1's "S1 < 18 or S1 > 55" becomes two rules, since the builder does not
parse "or" and no sibling document uses it.

Co-Authored-By: Claude Opus 5.5 <noreply@anthropic.com>
</commit_message>
<xml_diff>
--- a/fixtures/qre-samples/QRE_1_Simple_RTD_Coffee_Tracker.docx
+++ b/fixtures/qre-samples/QRE_1_Simple_RTD_Coffee_Tracker.docx
@@ -2493,7 +2493,7 @@
                 <w:szCs w:val="15"/>
                 <w:rtl w:val="0"/>
               </w:rPr>
-              <w:t>S1 &lt; 18 or S1 &gt; 55</w:t>
+              <w:t>S1 &lt; 18</w:t>
             </w:r>
           </w:p>
         </w:tc>
@@ -2597,6 +2597,110 @@
                 <w:szCs w:val="15"/>
                 <w:rtl w:val="0"/>
               </w:rPr>
+              <w:t>S1 &gt; 55</w:t>
+            </w:r>
+          </w:p>
+        </w:tc>
+        <w:tc>
+          <w:tcPr>
+            <w:tcMar>
+              <w:top w:w="80.0" w:type="dxa"/>
+              <w:bottom w:w="80.0" w:type="dxa"/>
+            </w:tcMar>
+            <w:vAlign w:val="center"/>
+          </w:tcPr>
+          <w:p>
+            <w:pPr>
+              <w:spacing w:after="0" w:line="240" w:lineRule="auto"/>
+              <w:rPr/>
+            </w:pPr>
+            <w:r>
+              <w:rPr>
+                <w:rFonts w:ascii="Calibri" w:cs="Calibri" w:eastAsia="Calibri" w:hAnsi="Calibri"/>
+                <w:sz w:val="15"/>
+                <w:szCs w:val="15"/>
+                <w:rtl w:val="0"/>
+              </w:rPr>
+              <w:t>terminate</w:t>
+            </w:r>
+          </w:p>
+        </w:tc>
+        <w:tc>
+          <w:tcPr>
+            <w:tcMar>
+              <w:top w:w="80.0" w:type="dxa"/>
+              <w:bottom w:w="80.0" w:type="dxa"/>
+            </w:tcMar>
+            <w:vAlign w:val="center"/>
+          </w:tcPr>
+          <w:p>
+            <w:pPr>
+              <w:spacing w:after="0" w:line="240" w:lineRule="auto"/>
+              <w:rPr/>
+            </w:pPr>
+            <w:r>
+              <w:rPr>
+                <w:rFonts w:ascii="Calibri" w:cs="Calibri" w:eastAsia="Calibri" w:hAnsi="Calibri"/>
+                <w:sz w:val="15"/>
+                <w:szCs w:val="15"/>
+                <w:rtl w:val="0"/>
+              </w:rPr>
+              <w:t>TERM_10</w:t>
+            </w:r>
+          </w:p>
+        </w:tc>
+      </w:tr>
+      <w:tr>
+        <w:trPr>
+          <w:cantSplit w:val="0"/>
+          <w:tblHeader w:val="0"/>
+        </w:trPr>
+        <w:tc>
+          <w:tcPr>
+            <w:tcMar>
+              <w:top w:w="80.0" w:type="dxa"/>
+              <w:bottom w:w="80.0" w:type="dxa"/>
+            </w:tcMar>
+            <w:vAlign w:val="center"/>
+          </w:tcPr>
+          <w:p>
+            <w:pPr>
+              <w:spacing w:after="0" w:line="240" w:lineRule="auto"/>
+              <w:rPr/>
+            </w:pPr>
+            <w:r>
+              <w:rPr>
+                <w:rFonts w:ascii="Calibri" w:cs="Calibri" w:eastAsia="Calibri" w:hAnsi="Calibri"/>
+                <w:b w:val="1"/>
+                <w:bCs w:val="1"/>
+                <w:sz w:val="15"/>
+                <w:szCs w:val="15"/>
+                <w:rtl w:val="0"/>
+              </w:rPr>
+              <w:t>R3</w:t>
+            </w:r>
+          </w:p>
+        </w:tc>
+        <w:tc>
+          <w:tcPr>
+            <w:tcMar>
+              <w:top w:w="80.0" w:type="dxa"/>
+              <w:bottom w:w="80.0" w:type="dxa"/>
+            </w:tcMar>
+            <w:vAlign w:val="center"/>
+          </w:tcPr>
+          <w:p>
+            <w:pPr>
+              <w:spacing w:after="0" w:line="240" w:lineRule="auto"/>
+              <w:rPr/>
+            </w:pPr>
+            <w:r>
+              <w:rPr>
+                <w:rFonts w:ascii="Calibri" w:cs="Calibri" w:eastAsia="Calibri" w:hAnsi="Calibri"/>
+                <w:sz w:val="15"/>
+                <w:szCs w:val="15"/>
+                <w:rtl w:val="0"/>
+              </w:rPr>
               <w:t>S2 in ['Prefer to self-describe','Prefer not to say']</w:t>
             </w:r>
           </w:p>
@@ -2677,7 +2781,7 @@
                 <w:szCs w:val="15"/>
                 <w:rtl w:val="0"/>
               </w:rPr>
-              <w:t>R3</w:t>
+              <w:t>R4</w:t>
             </w:r>
           </w:p>
         </w:tc>
@@ -2781,7 +2885,7 @@
                 <w:szCs w:val="15"/>
                 <w:rtl w:val="0"/>
               </w:rPr>
-              <w:t>R4</w:t>
+              <w:t>R5</w:t>
             </w:r>
           </w:p>
         </w:tc>
@@ -2885,7 +2989,7 @@
                 <w:szCs w:val="15"/>
                 <w:rtl w:val="0"/>
               </w:rPr>
-              <w:t>R5</w:t>
+              <w:t>R6</w:t>
             </w:r>
           </w:p>
         </w:tc>
@@ -2989,7 +3093,7 @@
                 <w:szCs w:val="15"/>
                 <w:rtl w:val="0"/>
               </w:rPr>
-              <w:t>R6</w:t>
+              <w:t>R7</w:t>
             </w:r>
           </w:p>
         </w:tc>
@@ -3093,7 +3197,7 @@
                 <w:szCs w:val="15"/>
                 <w:rtl w:val="0"/>
               </w:rPr>
-              <w:t>R7</w:t>
+              <w:t>R8</w:t>
             </w:r>
           </w:p>
         </w:tc>

</xml_diff>